<commit_message>
Rick e Renner: revisão da Parte 1
Co-Authored-By: Claude Opus 5.5 <noreply@anthropic.com>
Claude-Session: https://claude.ai/code/session_01MJjUEEZrxQDEUifKK2vj9g
</commit_message>
<xml_diff>
--- a/roteiros/rick-e-renner/RickRenner_Parte1_Introducao.docx
+++ b/roteiros/rick-e-renner/RickRenner_Parte1_Introducao.docx
@@ -23,7 +23,7 @@
         <w:rPr>
           <w:color w:val="C00000"/>
         </w:rPr>
-        <w:t>O que pouca gente lembra é que essa dupla esteve perto do fim muitas vezes antes disso. Por causa de noites que o próprio público preferiu esquecer.</w:t>
+        <w:t>O que pouca gente lembra é que essa dupla esteve perto do fim mais de uma vez antes disso. Por causa de noites sombrias que o próprio público preferiu esquecer.</w:t>
       </w:r>
     </w:p>
     <w:p>
@@ -127,7 +127,7 @@
         <w:rPr>
           <w:color w:val="000000"/>
         </w:rPr>
-        <w:t>Segundo a história contada pela própria dupla, Geraldo precisava de equipamento de som emprestado. Ligou para uma casa noturna de Brasília.</w:t>
+        <w:t>Segundo a história registrada da dupla, Geraldo precisava de equipamento de som emprestado. Ligou para uma casa noturna de Brasília.</w:t>
       </w:r>
     </w:p>
     <w:p>
@@ -159,7 +159,7 @@
         <w:rPr>
           <w:color w:val="000000"/>
         </w:rPr>
-        <w:t>Um tinha vinte anos e vinha do interior. O outro era um adolescente da capital que cantava rock.</w:t>
+        <w:t>Um tinha cerca de vinte anos e vinha do interior. O outro era um adolescente da capital que cantava rock.</w:t>
       </w:r>
     </w:p>
     <w:p>
@@ -199,7 +199,7 @@
         <w:rPr>
           <w:color w:val="C00000"/>
         </w:rPr>
-        <w:t>Aquele disco independente não mudou a vida deles de uma hora para outra. Mas abriu caminho até uma dupla que estava prestes a virar a maior do Brasil. E foi ela que abriu a porta.</w:t>
+        <w:t>Aquele disco independente não mudou a vida deles de uma hora para outra. Mas ajudou a levar os dois até uma dupla que estava prestes a virar a maior do Brasil. E foi ela que abriu a porta.</w:t>
       </w:r>
     </w:p>
     <w:p>
@@ -239,7 +239,7 @@
         <w:rPr>
           <w:color w:val="000000"/>
         </w:rPr>
-        <w:t>Rick era o mais velho e o principal compositor da dupla.</w:t>
+        <w:t>Rick era o mais velho.</w:t>
       </w:r>
     </w:p>
     <w:p>
@@ -279,7 +279,7 @@
         <w:rPr>
           <w:color w:val="C00000"/>
         </w:rPr>
-        <w:t>Porque, longe do palco, a vida de Renner ia tomar um caminho que Rick não conseguiu controlar. Um caminho que começou numa estrada no interior de São Paulo e terminou numa clínica de reabilitação. E cada parada desse caminho quase acabou com a dupla.</w:t>
+        <w:t>Porque, longe do palco, a vida de Renner ia tomar um caminho que Rick não conseguiu controlar. Um caminho que passou por uma estrada no interior de São Paulo e chegou até uma clínica de reabilitação. E cada parada desse caminho quase acabou com a dupla.</w:t>
       </w:r>
     </w:p>
     <w:sectPr>

</xml_diff>